<commit_message>
Buy two more EMCOR shares to meet the $20,000 minimum
Co-Authored-By: Claude Opus 5.5 <noreply@anthropic.com>
</commit_message>
<xml_diff>
--- a/Stock-Picks-Data-Centers.docx
+++ b/Stock-Picks-Data-Centers.docx
@@ -82,7 +82,7 @@
           <w:rFonts w:ascii="Calibri" w:cs="Calibri" w:eastAsia="Calibri" w:hAnsi="Calibri"/>
           <w:color w:val="1F2937"/>
         </w:rPr>
-        <w:t xml:space="preserve">$20,000.00</w:t>
+        <w:t xml:space="preserve">$20,000 to $25,000</w:t>
       </w:r>
     </w:p>
     <w:p>
@@ -108,7 +108,7 @@
           <w:rFonts w:ascii="Calibri" w:cs="Calibri" w:eastAsia="Calibri" w:hAnsi="Calibri"/>
           <w:color w:val="1F2937"/>
         </w:rPr>
-        <w:t xml:space="preserve">$19,706.18 in 13 companies. $293.82 is left as a cushion, so the order still fits under $20,000 if prices rise before the buy.</w:t>
+        <w:t xml:space="preserve">$21,043.64 in 13 companies, inside the budget range.</w:t>
       </w:r>
     </w:p>
     <w:p>
@@ -134,7 +134,7 @@
           <w:rFonts w:ascii="Calibri" w:cs="Calibri" w:eastAsia="Calibri" w:hAnsi="Calibri"/>
           <w:color w:val="1F2937"/>
         </w:rPr>
-        <w:t xml:space="preserve">$9,513.44 (48.3%) in five companies that build, supply or own data centers. The other eight companies get about 5–7% each.</w:t>
+        <w:t xml:space="preserve">$10,850.90 (51.6%) in five companies that build, supply or own data centers. The other eight companies get about 5–6% each.</w:t>
       </w:r>
     </w:p>
     <w:p>
@@ -666,7 +666,7 @@
                 <w:sz w:val="19"/>
                 <w:szCs w:val="19"/>
               </w:rPr>
-              <w:t xml:space="preserve">Up to $20,000</w:t>
+              <w:t xml:space="preserve">$20,000–$25,000</w:t>
             </w:r>
           </w:p>
         </w:tc>
@@ -699,7 +699,7 @@
                 <w:sz w:val="19"/>
                 <w:szCs w:val="19"/>
               </w:rPr>
-              <w:t xml:space="preserve">$19,706.18</w:t>
+              <w:t xml:space="preserve">$21,043.64</w:t>
             </w:r>
           </w:p>
         </w:tc>
@@ -774,7 +774,7 @@
           <w:bCs/>
           <w:color w:val="0F4C5C"/>
         </w:rPr>
-        <w:t xml:space="preserve">The builders (about 48%). </w:t>
+        <w:t xml:space="preserve">The builders (about 52%). </w:t>
       </w:r>
       <w:r>
         <w:rPr>
@@ -795,7 +795,7 @@
           <w:bCs/>
           <w:color w:val="0F4C5C"/>
         </w:rPr>
-        <w:t xml:space="preserve">The balance (about 52%). </w:t>
+        <w:t xml:space="preserve">The balance (about 48%). </w:t>
       </w:r>
       <w:r>
         <w:rPr>
@@ -1107,7 +1107,7 @@
                 <w:sz w:val="19"/>
                 <w:szCs w:val="19"/>
               </w:rPr>
-              <w:t xml:space="preserve">The builders: $9,513.44 (48.3%)</w:t>
+              <w:t xml:space="preserve">The builders: $10,850.90 (51.6%)</w:t>
             </w:r>
           </w:p>
         </w:tc>
@@ -1279,7 +1279,7 @@
                 <w:sz w:val="19"/>
                 <w:szCs w:val="19"/>
               </w:rPr>
-              <w:t xml:space="preserve">3</w:t>
+              <w:t xml:space="preserve">5</w:t>
             </w:r>
           </w:p>
         </w:tc>
@@ -1313,7 +1313,7 @@
                 <w:sz w:val="19"/>
                 <w:szCs w:val="19"/>
               </w:rPr>
-              <w:t xml:space="preserve">$2,006.19</w:t>
+              <w:t xml:space="preserve">$3,343.65</w:t>
             </w:r>
           </w:p>
         </w:tc>
@@ -1347,7 +1347,7 @@
                 <w:sz w:val="19"/>
                 <w:szCs w:val="19"/>
               </w:rPr>
-              <w:t xml:space="preserve">10.2%</w:t>
+              <w:t xml:space="preserve">15.9%</w:t>
             </w:r>
           </w:p>
         </w:tc>
@@ -1587,7 +1587,7 @@
                 <w:sz w:val="19"/>
                 <w:szCs w:val="19"/>
               </w:rPr>
-              <w:t xml:space="preserve">11.6%</w:t>
+              <w:t xml:space="preserve">10.8%</w:t>
             </w:r>
           </w:p>
         </w:tc>
@@ -1827,7 +1827,7 @@
                 <w:sz w:val="19"/>
                 <w:szCs w:val="19"/>
               </w:rPr>
-              <w:t xml:space="preserve">7.5%</w:t>
+              <w:t xml:space="preserve">7.0%</w:t>
             </w:r>
           </w:p>
         </w:tc>
@@ -2067,7 +2067,7 @@
                 <w:sz w:val="19"/>
                 <w:szCs w:val="19"/>
               </w:rPr>
-              <w:t xml:space="preserve">9.3%</w:t>
+              <w:t xml:space="preserve">8.7%</w:t>
             </w:r>
           </w:p>
         </w:tc>
@@ -2307,7 +2307,7 @@
                 <w:sz w:val="19"/>
                 <w:szCs w:val="19"/>
               </w:rPr>
-              <w:t xml:space="preserve">9.7%</w:t>
+              <w:t xml:space="preserve">9.1%</w:t>
             </w:r>
           </w:p>
         </w:tc>
@@ -2341,7 +2341,7 @@
                 <w:sz w:val="19"/>
                 <w:szCs w:val="19"/>
               </w:rPr>
-              <w:t xml:space="preserve">The balance: $10,192.74 (51.7%)</w:t>
+              <w:t xml:space="preserve">The balance: $10,192.74 (48.4%)</w:t>
             </w:r>
           </w:p>
         </w:tc>
@@ -2581,7 +2581,7 @@
                 <w:sz w:val="19"/>
                 <w:szCs w:val="19"/>
               </w:rPr>
-              <w:t xml:space="preserve">5.4%</w:t>
+              <w:t xml:space="preserve">5.0%</w:t>
             </w:r>
           </w:p>
         </w:tc>
@@ -2821,7 +2821,7 @@
                 <w:sz w:val="19"/>
                 <w:szCs w:val="19"/>
               </w:rPr>
-              <w:t xml:space="preserve">6.5%</w:t>
+              <w:t xml:space="preserve">6.1%</w:t>
             </w:r>
           </w:p>
         </w:tc>
@@ -3061,7 +3061,7 @@
                 <w:sz w:val="19"/>
                 <w:szCs w:val="19"/>
               </w:rPr>
-              <w:t xml:space="preserve">6.6%</w:t>
+              <w:t xml:space="preserve">6.2%</w:t>
             </w:r>
           </w:p>
         </w:tc>
@@ -3301,7 +3301,7 @@
                 <w:sz w:val="19"/>
                 <w:szCs w:val="19"/>
               </w:rPr>
-              <w:t xml:space="preserve">6.5%</w:t>
+              <w:t xml:space="preserve">6.1%</w:t>
             </w:r>
           </w:p>
         </w:tc>
@@ -3541,7 +3541,7 @@
                 <w:sz w:val="19"/>
                 <w:szCs w:val="19"/>
               </w:rPr>
-              <w:t xml:space="preserve">6.7%</w:t>
+              <w:t xml:space="preserve">6.3%</w:t>
             </w:r>
           </w:p>
         </w:tc>
@@ -3781,7 +3781,7 @@
                 <w:sz w:val="19"/>
                 <w:szCs w:val="19"/>
               </w:rPr>
-              <w:t xml:space="preserve">6.8%</w:t>
+              <w:t xml:space="preserve">6.4%</w:t>
             </w:r>
           </w:p>
         </w:tc>
@@ -4021,7 +4021,7 @@
                 <w:sz w:val="19"/>
                 <w:szCs w:val="19"/>
               </w:rPr>
-              <w:t xml:space="preserve">6.7%</w:t>
+              <w:t xml:space="preserve">6.2%</w:t>
             </w:r>
           </w:p>
         </w:tc>
@@ -4261,7 +4261,7 @@
                 <w:sz w:val="19"/>
                 <w:szCs w:val="19"/>
               </w:rPr>
-              <w:t xml:space="preserve">6.5%</w:t>
+              <w:t xml:space="preserve">6.1%</w:t>
             </w:r>
           </w:p>
         </w:tc>
@@ -4467,7 +4467,7 @@
                 <w:sz w:val="19"/>
                 <w:szCs w:val="19"/>
               </w:rPr>
-              <w:t xml:space="preserve">$19,706.18</w:t>
+              <w:t xml:space="preserve">$21,043.64</w:t>
             </w:r>
           </w:p>
         </w:tc>
@@ -4502,246 +4502,6 @@
                 <w:szCs w:val="19"/>
               </w:rPr>
               <w:t xml:space="preserve">100%</w:t>
-            </w:r>
-          </w:p>
-        </w:tc>
-      </w:tr>
-      <w:tr>
-        <w:tc>
-          <w:tcPr>
-            <w:tcW w:type="dxa" w:w="900"/>
-            <w:tcBorders>
-              <w:top w:val="single" w:color="D1D5DB" w:sz="4"/>
-              <w:left w:val="single" w:color="D1D5DB" w:sz="4"/>
-              <w:bottom w:val="single" w:color="D1D5DB" w:sz="4"/>
-              <w:right w:val="single" w:color="D1D5DB" w:sz="4"/>
-            </w:tcBorders>
-            <w:shd w:fill="FFFFFF" w:color="auto" w:val="clear"/>
-            <w:tcMar>
-              <w:top w:type="dxa" w:w="60"/>
-              <w:left w:type="dxa" w:w="100"/>
-              <w:bottom w:type="dxa" w:w="60"/>
-              <w:right w:type="dxa" w:w="100"/>
-            </w:tcMar>
-          </w:tcPr>
-          <w:p>
-            <w:pPr>
-              <w:jc w:val="left"/>
-            </w:pPr>
-            <w:r>
-              <w:rPr>
-                <w:rFonts w:ascii="Calibri" w:cs="Calibri" w:eastAsia="Calibri" w:hAnsi="Calibri"/>
-                <w:b w:val="false"/>
-                <w:bCs w:val="false"/>
-                <w:color w:val="1F2937"/>
-                <w:sz w:val="19"/>
-                <w:szCs w:val="19"/>
-              </w:rPr>
-              <w:t xml:space="preserve"/>
-            </w:r>
-          </w:p>
-        </w:tc>
-        <w:tc>
-          <w:tcPr>
-            <w:tcW w:type="dxa" w:w="2200"/>
-            <w:tcBorders>
-              <w:top w:val="single" w:color="D1D5DB" w:sz="4"/>
-              <w:left w:val="single" w:color="D1D5DB" w:sz="4"/>
-              <w:bottom w:val="single" w:color="D1D5DB" w:sz="4"/>
-              <w:right w:val="single" w:color="D1D5DB" w:sz="4"/>
-            </w:tcBorders>
-            <w:shd w:fill="FFFFFF" w:color="auto" w:val="clear"/>
-            <w:tcMar>
-              <w:top w:type="dxa" w:w="60"/>
-              <w:left w:type="dxa" w:w="100"/>
-              <w:bottom w:type="dxa" w:w="60"/>
-              <w:right w:type="dxa" w:w="100"/>
-            </w:tcMar>
-          </w:tcPr>
-          <w:p>
-            <w:pPr>
-              <w:jc w:val="left"/>
-            </w:pPr>
-            <w:r>
-              <w:rPr>
-                <w:rFonts w:ascii="Calibri" w:cs="Calibri" w:eastAsia="Calibri" w:hAnsi="Calibri"/>
-                <w:b w:val="false"/>
-                <w:bCs w:val="false"/>
-                <w:color w:val="1F2937"/>
-                <w:sz w:val="19"/>
-                <w:szCs w:val="19"/>
-              </w:rPr>
-              <w:t xml:space="preserve">Cash cushion</w:t>
-            </w:r>
-          </w:p>
-        </w:tc>
-        <w:tc>
-          <w:tcPr>
-            <w:tcW w:type="dxa" w:w="2300"/>
-            <w:tcBorders>
-              <w:top w:val="single" w:color="D1D5DB" w:sz="4"/>
-              <w:left w:val="single" w:color="D1D5DB" w:sz="4"/>
-              <w:bottom w:val="single" w:color="D1D5DB" w:sz="4"/>
-              <w:right w:val="single" w:color="D1D5DB" w:sz="4"/>
-            </w:tcBorders>
-            <w:shd w:fill="FFFFFF" w:color="auto" w:val="clear"/>
-            <w:tcMar>
-              <w:top w:type="dxa" w:w="60"/>
-              <w:left w:type="dxa" w:w="100"/>
-              <w:bottom w:type="dxa" w:w="60"/>
-              <w:right w:type="dxa" w:w="100"/>
-            </w:tcMar>
-          </w:tcPr>
-          <w:p>
-            <w:pPr>
-              <w:jc w:val="left"/>
-            </w:pPr>
-            <w:r>
-              <w:rPr>
-                <w:rFonts w:ascii="Calibri" w:cs="Calibri" w:eastAsia="Calibri" w:hAnsi="Calibri"/>
-                <w:b w:val="false"/>
-                <w:bCs w:val="false"/>
-                <w:color w:val="1F2937"/>
-                <w:sz w:val="19"/>
-                <w:szCs w:val="19"/>
-              </w:rPr>
-              <w:t xml:space="preserve"/>
-            </w:r>
-          </w:p>
-        </w:tc>
-        <w:tc>
-          <w:tcPr>
-            <w:tcW w:type="dxa" w:w="1000"/>
-            <w:tcBorders>
-              <w:top w:val="single" w:color="D1D5DB" w:sz="4"/>
-              <w:left w:val="single" w:color="D1D5DB" w:sz="4"/>
-              <w:bottom w:val="single" w:color="D1D5DB" w:sz="4"/>
-              <w:right w:val="single" w:color="D1D5DB" w:sz="4"/>
-            </w:tcBorders>
-            <w:shd w:fill="FFFFFF" w:color="auto" w:val="clear"/>
-            <w:tcMar>
-              <w:top w:type="dxa" w:w="60"/>
-              <w:left w:type="dxa" w:w="100"/>
-              <w:bottom w:type="dxa" w:w="60"/>
-              <w:right w:type="dxa" w:w="100"/>
-            </w:tcMar>
-          </w:tcPr>
-          <w:p>
-            <w:pPr>
-              <w:jc w:val="right"/>
-            </w:pPr>
-            <w:r>
-              <w:rPr>
-                <w:rFonts w:ascii="Calibri" w:cs="Calibri" w:eastAsia="Calibri" w:hAnsi="Calibri"/>
-                <w:b w:val="false"/>
-                <w:bCs w:val="false"/>
-                <w:color w:val="1F2937"/>
-                <w:sz w:val="19"/>
-                <w:szCs w:val="19"/>
-              </w:rPr>
-              <w:t xml:space="preserve"/>
-            </w:r>
-          </w:p>
-        </w:tc>
-        <w:tc>
-          <w:tcPr>
-            <w:tcW w:type="dxa" w:w="800"/>
-            <w:tcBorders>
-              <w:top w:val="single" w:color="D1D5DB" w:sz="4"/>
-              <w:left w:val="single" w:color="D1D5DB" w:sz="4"/>
-              <w:bottom w:val="single" w:color="D1D5DB" w:sz="4"/>
-              <w:right w:val="single" w:color="D1D5DB" w:sz="4"/>
-            </w:tcBorders>
-            <w:shd w:fill="FFFFFF" w:color="auto" w:val="clear"/>
-            <w:tcMar>
-              <w:top w:type="dxa" w:w="60"/>
-              <w:left w:type="dxa" w:w="100"/>
-              <w:bottom w:type="dxa" w:w="60"/>
-              <w:right w:type="dxa" w:w="100"/>
-            </w:tcMar>
-          </w:tcPr>
-          <w:p>
-            <w:pPr>
-              <w:jc w:val="right"/>
-            </w:pPr>
-            <w:r>
-              <w:rPr>
-                <w:rFonts w:ascii="Calibri" w:cs="Calibri" w:eastAsia="Calibri" w:hAnsi="Calibri"/>
-                <w:b w:val="false"/>
-                <w:bCs w:val="false"/>
-                <w:color w:val="1F2937"/>
-                <w:sz w:val="19"/>
-                <w:szCs w:val="19"/>
-              </w:rPr>
-              <w:t xml:space="preserve"/>
-            </w:r>
-          </w:p>
-        </w:tc>
-        <w:tc>
-          <w:tcPr>
-            <w:tcW w:type="dxa" w:w="1160"/>
-            <w:tcBorders>
-              <w:top w:val="single" w:color="D1D5DB" w:sz="4"/>
-              <w:left w:val="single" w:color="D1D5DB" w:sz="4"/>
-              <w:bottom w:val="single" w:color="D1D5DB" w:sz="4"/>
-              <w:right w:val="single" w:color="D1D5DB" w:sz="4"/>
-            </w:tcBorders>
-            <w:shd w:fill="FFFFFF" w:color="auto" w:val="clear"/>
-            <w:tcMar>
-              <w:top w:type="dxa" w:w="60"/>
-              <w:left w:type="dxa" w:w="100"/>
-              <w:bottom w:type="dxa" w:w="60"/>
-              <w:right w:type="dxa" w:w="100"/>
-            </w:tcMar>
-          </w:tcPr>
-          <w:p>
-            <w:pPr>
-              <w:jc w:val="right"/>
-            </w:pPr>
-            <w:r>
-              <w:rPr>
-                <w:rFonts w:ascii="Calibri" w:cs="Calibri" w:eastAsia="Calibri" w:hAnsi="Calibri"/>
-                <w:b w:val="false"/>
-                <w:bCs w:val="false"/>
-                <w:color w:val="1F2937"/>
-                <w:sz w:val="19"/>
-                <w:szCs w:val="19"/>
-              </w:rPr>
-              <w:t xml:space="preserve">$293.82</w:t>
-            </w:r>
-          </w:p>
-        </w:tc>
-        <w:tc>
-          <w:tcPr>
-            <w:tcW w:type="dxa" w:w="1000"/>
-            <w:tcBorders>
-              <w:top w:val="single" w:color="D1D5DB" w:sz="4"/>
-              <w:left w:val="single" w:color="D1D5DB" w:sz="4"/>
-              <w:bottom w:val="single" w:color="D1D5DB" w:sz="4"/>
-              <w:right w:val="single" w:color="D1D5DB" w:sz="4"/>
-            </w:tcBorders>
-            <w:shd w:fill="FFFFFF" w:color="auto" w:val="clear"/>
-            <w:tcMar>
-              <w:top w:type="dxa" w:w="60"/>
-              <w:left w:type="dxa" w:w="100"/>
-              <w:bottom w:type="dxa" w:w="60"/>
-              <w:right w:type="dxa" w:w="100"/>
-            </w:tcMar>
-          </w:tcPr>
-          <w:p>
-            <w:pPr>
-              <w:jc w:val="right"/>
-            </w:pPr>
-            <w:r>
-              <w:rPr>
-                <w:rFonts w:ascii="Calibri" w:cs="Calibri" w:eastAsia="Calibri" w:hAnsi="Calibri"/>
-                <w:b w:val="false"/>
-                <w:bCs w:val="false"/>
-                <w:color w:val="1F2937"/>
-                <w:sz w:val="19"/>
-                <w:szCs w:val="19"/>
-              </w:rPr>
-              <w:t xml:space="preserve"/>
             </w:r>
           </w:p>
         </w:tc>
@@ -5030,7 +4790,7 @@
                 <w:sz w:val="19"/>
                 <w:szCs w:val="19"/>
               </w:rPr>
-              <w:t xml:space="preserve">$5,768.51</w:t>
+              <w:t xml:space="preserve">$7,105.97</w:t>
             </w:r>
           </w:p>
         </w:tc>
@@ -5064,7 +4824,7 @@
                 <w:sz w:val="19"/>
                 <w:szCs w:val="19"/>
               </w:rPr>
-              <w:t xml:space="preserve">29.3%</w:t>
+              <w:t xml:space="preserve">33.8%</w:t>
             </w:r>
           </w:p>
         </w:tc>
@@ -5202,7 +4962,7 @@
                 <w:sz w:val="19"/>
                 <w:szCs w:val="19"/>
               </w:rPr>
-              <w:t xml:space="preserve">9.3%</w:t>
+              <w:t xml:space="preserve">8.7%</w:t>
             </w:r>
           </w:p>
         </w:tc>
@@ -5340,7 +5100,7 @@
                 <w:sz w:val="19"/>
                 <w:szCs w:val="19"/>
               </w:rPr>
-              <w:t xml:space="preserve">9.7%</w:t>
+              <w:t xml:space="preserve">9.1%</w:t>
             </w:r>
           </w:p>
         </w:tc>
@@ -5478,7 +5238,7 @@
                 <w:sz w:val="19"/>
                 <w:szCs w:val="19"/>
               </w:rPr>
-              <w:t xml:space="preserve">5.4%</w:t>
+              <w:t xml:space="preserve">5.0%</w:t>
             </w:r>
           </w:p>
         </w:tc>
@@ -5612,7 +5372,7 @@
                 <w:sz w:val="19"/>
                 <w:szCs w:val="19"/>
               </w:rPr>
-              <w:t xml:space="preserve">6.5%</w:t>
+              <w:t xml:space="preserve">6.1%</w:t>
             </w:r>
           </w:p>
         </w:tc>
@@ -5750,7 +5510,7 @@
                 <w:sz w:val="19"/>
                 <w:szCs w:val="19"/>
               </w:rPr>
-              <w:t xml:space="preserve">6.6%</w:t>
+              <w:t xml:space="preserve">6.2%</w:t>
             </w:r>
           </w:p>
         </w:tc>
@@ -5884,7 +5644,7 @@
                 <w:sz w:val="19"/>
                 <w:szCs w:val="19"/>
               </w:rPr>
-              <w:t xml:space="preserve">6.5%</w:t>
+              <w:t xml:space="preserve">6.1%</w:t>
             </w:r>
           </w:p>
         </w:tc>
@@ -6022,7 +5782,7 @@
                 <w:sz w:val="19"/>
                 <w:szCs w:val="19"/>
               </w:rPr>
-              <w:t xml:space="preserve">6.7%</w:t>
+              <w:t xml:space="preserve">6.3%</w:t>
             </w:r>
           </w:p>
         </w:tc>
@@ -6156,7 +5916,7 @@
                 <w:sz w:val="19"/>
                 <w:szCs w:val="19"/>
               </w:rPr>
-              <w:t xml:space="preserve">6.8%</w:t>
+              <w:t xml:space="preserve">6.4%</w:t>
             </w:r>
           </w:p>
         </w:tc>
@@ -6294,7 +6054,7 @@
                 <w:sz w:val="19"/>
                 <w:szCs w:val="19"/>
               </w:rPr>
-              <w:t xml:space="preserve">6.7%</w:t>
+              <w:t xml:space="preserve">6.2%</w:t>
             </w:r>
           </w:p>
         </w:tc>
@@ -6428,7 +6188,7 @@
                 <w:sz w:val="19"/>
                 <w:szCs w:val="19"/>
               </w:rPr>
-              <w:t xml:space="preserve">6.5%</w:t>
+              <w:t xml:space="preserve">6.1%</w:t>
             </w:r>
           </w:p>
         </w:tc>
@@ -6585,7 +6345,7 @@
           <w:sz w:val="20"/>
           <w:szCs w:val="20"/>
         </w:rPr>
-        <w:t xml:space="preserve">Industrials  ·  Builder  ·  3 shares × $668.73 = $2,006.19 (10.2%)</w:t>
+        <w:t xml:space="preserve">Industrials  ·  Builder  ·  5 shares × $668.73 = $3,343.65 (15.9%)</w:t>
       </w:r>
     </w:p>
     <w:p>
@@ -6627,7 +6387,7 @@
           <w:rFonts w:ascii="Calibri" w:cs="Calibri" w:eastAsia="Calibri" w:hAnsi="Calibri"/>
           <w:color w:val="1F2937"/>
         </w:rPr>
-        <w:t xml:space="preserve">Electrical and cooling systems are the most expensive part of building a data center, and that is EMCOR’s core work. Its Q2 2026 revenue rose 19.8% to $5.15 billion, earnings per share rose 34.8% to $9.06, and it raised its full-year guidance. Its backlog of signed work hit a record $17.14 billion, up 43.9% in a year, with the biggest gains in the segment that includes data centers. At about 19 times next year’s earnings, it is the best-value builder in this portfolio.</w:t>
+        <w:t xml:space="preserve">Electrical and cooling systems are the most expensive part of building a data center, and that is EMCOR’s core work. Its Q2 2026 revenue rose 19.8% to $5.15 billion, earnings per share rose 34.8% to $9.06, and it raised its full-year guidance. Its backlog of signed work hit a record $17.14 billion, up 43.9% in a year, with the biggest gains in the segment that includes data centers. At about 19 times next year’s earnings, it is the best-value builder in this portfolio, which is why it is also the largest position.</w:t>
       </w:r>
     </w:p>
     <w:p>
@@ -6686,7 +6446,7 @@
           <w:sz w:val="20"/>
           <w:szCs w:val="20"/>
         </w:rPr>
-        <w:t xml:space="preserve">Industrials  ·  Builder  ·  4 shares × $570.49 = $2,281.96 (11.6%)</w:t>
+        <w:t xml:space="preserve">Industrials  ·  Builder  ·  4 shares × $570.49 = $2,281.96 (10.8%)</w:t>
       </w:r>
     </w:p>
     <w:p>
@@ -6728,7 +6488,7 @@
           <w:rFonts w:ascii="Calibri" w:cs="Calibri" w:eastAsia="Calibri" w:hAnsi="Calibri"/>
           <w:color w:val="1F2937"/>
         </w:rPr>
-        <w:t xml:space="preserve">Analysts call electricity the biggest bottleneck for new data centers. A finished building is useless until it is connected to the grid, and Quanta does that work. It also benefits from grid upgrades that have nothing to do with AI, such as replacing aging lines and hardening against storms, which gives it demand even if AI spending slows. This is the largest position in the portfolio.</w:t>
+        <w:t xml:space="preserve">Analysts call electricity the biggest bottleneck for new data centers. A finished building is useless until it is connected to the grid, and Quanta does that work. It also benefits from grid upgrades that have nothing to do with AI, such as replacing aging lines and hardening against storms, which gives it demand even if AI spending slows.</w:t>
       </w:r>
     </w:p>
     <w:p>
@@ -6787,7 +6547,7 @@
           <w:sz w:val="20"/>
           <w:szCs w:val="20"/>
         </w:rPr>
-        <w:t xml:space="preserve">Industrials  ·  Builder  ·  4 shares × $370.09 = $1,480.36 (7.5%)</w:t>
+        <w:t xml:space="preserve">Industrials  ·  Builder  ·  4 shares × $370.09 = $1,480.36 (7.0%)</w:t>
       </w:r>
     </w:p>
     <w:p>
@@ -6888,7 +6648,7 @@
           <w:sz w:val="20"/>
           <w:szCs w:val="20"/>
         </w:rPr>
-        <w:t xml:space="preserve">Materials  ·  Builder  ·  7 shares × $262.30 = $1,836.10 (9.3%)</w:t>
+        <w:t xml:space="preserve">Materials  ·  Builder  ·  7 shares × $262.30 = $1,836.10 (8.7%)</w:t>
       </w:r>
     </w:p>
     <w:p>
@@ -6989,7 +6749,7 @@
           <w:sz w:val="20"/>
           <w:szCs w:val="20"/>
         </w:rPr>
-        <w:t xml:space="preserve">Real Estate  ·  Builder  ·  11 shares × $173.53 = $1,908.83 (9.7%)</w:t>
+        <w:t xml:space="preserve">Real Estate  ·  Builder  ·  11 shares × $173.53 = $1,908.83 (9.1%)</w:t>
       </w:r>
     </w:p>
     <w:p>
@@ -7090,7 +6850,7 @@
           <w:sz w:val="20"/>
           <w:szCs w:val="20"/>
         </w:rPr>
-        <w:t xml:space="preserve">Information Technology  ·  Balance  ·  2 shares × $529.95 = $1,059.90 (5.4%)</w:t>
+        <w:t xml:space="preserve">Information Technology  ·  Balance  ·  2 shares × $529.95 = $1,059.90 (5.0%)</w:t>
       </w:r>
     </w:p>
     <w:p>
@@ -7191,7 +6951,7 @@
           <w:sz w:val="20"/>
           <w:szCs w:val="20"/>
         </w:rPr>
-        <w:t xml:space="preserve">Communication Services  ·  Balance  ·  4 shares × $320.38 = $1,281.52 (6.5%)</w:t>
+        <w:t xml:space="preserve">Communication Services  ·  Balance  ·  4 shares × $320.38 = $1,281.52 (6.1%)</w:t>
       </w:r>
     </w:p>
     <w:p>
@@ -7292,7 +7052,7 @@
           <w:sz w:val="20"/>
           <w:szCs w:val="20"/>
         </w:rPr>
-        <w:t xml:space="preserve">Consumer Discretionary  ·  Balance  ·  9 shares × $144.99 = $1,304.91 (6.6%)</w:t>
+        <w:t xml:space="preserve">Consumer Discretionary  ·  Balance  ·  9 shares × $144.99 = $1,304.91 (6.2%)</w:t>
       </w:r>
     </w:p>
     <w:p>
@@ -7393,7 +7153,7 @@
           <w:sz w:val="20"/>
           <w:szCs w:val="20"/>
         </w:rPr>
-        <w:t xml:space="preserve">Consumer Staples  ·  Balance  ·  8 shares × $159.81 = $1,278.48 (6.5%)</w:t>
+        <w:t xml:space="preserve">Consumer Staples  ·  Balance  ·  8 shares × $159.81 = $1,278.48 (6.1%)</w:t>
       </w:r>
     </w:p>
     <w:p>
@@ -7494,7 +7254,7 @@
           <w:sz w:val="20"/>
           <w:szCs w:val="20"/>
         </w:rPr>
-        <w:t xml:space="preserve">Health Care  ·  Balance  ·  5 shares × $265.93 = $1,329.65 (6.7%)</w:t>
+        <w:t xml:space="preserve">Health Care  ·  Balance  ·  5 shares × $265.93 = $1,329.65 (6.3%)</w:t>
       </w:r>
     </w:p>
     <w:p>
@@ -7595,7 +7355,7 @@
           <w:sz w:val="20"/>
           <w:szCs w:val="20"/>
         </w:rPr>
-        <w:t xml:space="preserve">Financials  ·  Balance  ·  4 shares × $334.52 = $1,338.08 (6.8%)</w:t>
+        <w:t xml:space="preserve">Financials  ·  Balance  ·  4 shares × $334.52 = $1,338.08 (6.4%)</w:t>
       </w:r>
     </w:p>
     <w:p>
@@ -7696,7 +7456,7 @@
           <w:sz w:val="20"/>
           <w:szCs w:val="20"/>
         </w:rPr>
-        <w:t xml:space="preserve">Utilities  ·  Balance  ·  16 shares × $82.17 = $1,314.72 (6.7%)</w:t>
+        <w:t xml:space="preserve">Utilities  ·  Balance  ·  16 shares × $82.17 = $1,314.72 (6.2%)</w:t>
       </w:r>
     </w:p>
     <w:p>
@@ -7797,7 +7557,7 @@
           <w:sz w:val="20"/>
           <w:szCs w:val="20"/>
         </w:rPr>
-        <w:t xml:space="preserve">Energy  ·  Balance  ·  7 shares × $183.64 = $1,285.48 (6.5%)</w:t>
+        <w:t xml:space="preserve">Energy  ·  Balance  ·  7 shares × $183.64 = $1,285.48 (6.1%)</w:t>
       </w:r>
     </w:p>
     <w:p>
@@ -7908,7 +7668,7 @@
           <w:rFonts w:ascii="Calibri" w:cs="Calibri" w:eastAsia="Calibri" w:hAnsi="Calibri"/>
           <w:color w:val="1F2937"/>
         </w:rPr>
-        <w:t xml:space="preserve">About 48% depends on data-center construction continuing. Microsoft, Alphabet and NextEra are also connected to it. If tech companies cut spending sharply, more than half the portfolio would feel it.</w:t>
+        <w:t xml:space="preserve">About 52% depends on data-center construction continuing. Microsoft, Alphabet and NextEra are also connected to it. If tech companies cut spending sharply, more than half the portfolio would feel it.</w:t>
       </w:r>
     </w:p>
     <w:p>
@@ -7927,14 +7687,14 @@
           <w:bCs/>
           <w:color w:val="1F2937"/>
         </w:rPr>
-        <w:t xml:space="preserve">Industrials is 29% on its own. </w:t>
+        <w:t xml:space="preserve">Industrials is 34% on its own. </w:t>
       </w:r>
       <w:r>
         <w:rPr>
           <w:rFonts w:ascii="Calibri" w:cs="Calibri" w:eastAsia="Calibri" w:hAnsi="Calibri"/>
           <w:color w:val="1F2937"/>
         </w:rPr>
-        <w:t xml:space="preserve">That is the price of the tilt you asked for. The three contractors often move together, as they did on October 22, when all three fell 5–9% in one day.</w:t>
+        <w:t xml:space="preserve">That is the price of the tilt you asked for. EMCOR alone is about 16%. The three contractors often move together, as they did on October 22, when all three fell 5–9% in one day.</w:t>
       </w:r>
     </w:p>
     <w:p>
@@ -8553,7 +8313,7 @@
         </w:numPr>
         <w:spacing w:after="80" w:line="276"/>
       </w:pPr>
-      <w:hyperlink w:history="1" r:id="rIdex1t_3ypblzf_s8ltlweq">
+      <w:hyperlink w:history="1" r:id="rId9x4h9qnj63bccbs1hyxc7">
         <w:r>
           <w:rPr>
             <w:rStyle w:val="Hyperlink"/>
@@ -8572,7 +8332,7 @@
         </w:numPr>
         <w:spacing w:after="80" w:line="276"/>
       </w:pPr>
-      <w:hyperlink w:history="1" r:id="rIdjigzpjcbxr6n8wqhhkcud">
+      <w:hyperlink w:history="1" r:id="rIdbksvvjzqthtfj-opwh6ly">
         <w:r>
           <w:rPr>
             <w:rStyle w:val="Hyperlink"/>
@@ -8591,7 +8351,7 @@
         </w:numPr>
         <w:spacing w:after="80" w:line="276"/>
       </w:pPr>
-      <w:hyperlink w:history="1" r:id="rIdddpg9pwxfel9kwbhz59ey">
+      <w:hyperlink w:history="1" r:id="rIdk6ql3sbmlrebjpnwxlh2b">
         <w:r>
           <w:rPr>
             <w:rStyle w:val="Hyperlink"/>
@@ -8610,7 +8370,7 @@
         </w:numPr>
         <w:spacing w:after="80" w:line="276"/>
       </w:pPr>
-      <w:hyperlink w:history="1" r:id="rId9qqqgir9ukuvbjgwbpucv">
+      <w:hyperlink w:history="1" r:id="rIdfz3bxchebdbo_r8yfgyy5">
         <w:r>
           <w:rPr>
             <w:rStyle w:val="Hyperlink"/>
@@ -8629,7 +8389,7 @@
         </w:numPr>
         <w:spacing w:after="80" w:line="276"/>
       </w:pPr>
-      <w:hyperlink w:history="1" r:id="rIdvpohobd2byemtgrimrtfy">
+      <w:hyperlink w:history="1" r:id="rIdldr-ztun7kdwzqry-eltc">
         <w:r>
           <w:rPr>
             <w:rStyle w:val="Hyperlink"/>
@@ -8648,7 +8408,7 @@
         </w:numPr>
         <w:spacing w:after="80" w:line="276"/>
       </w:pPr>
-      <w:hyperlink w:history="1" r:id="rIdx7ycvlc9pm7pfkeh-ukof">
+      <w:hyperlink w:history="1" r:id="rIdd7amdrkzwfi05gxzhqkio">
         <w:r>
           <w:rPr>
             <w:rStyle w:val="Hyperlink"/>
@@ -8667,7 +8427,7 @@
         </w:numPr>
         <w:spacing w:after="80" w:line="276"/>
       </w:pPr>
-      <w:hyperlink w:history="1" r:id="rId_wsqn8chwaqdjbahpnwqx">
+      <w:hyperlink w:history="1" r:id="rIdivx9iixqqbthjjqhzxw7w">
         <w:r>
           <w:rPr>
             <w:rStyle w:val="Hyperlink"/>
@@ -8690,7 +8450,7 @@
           <w:sz w:val="18"/>
           <w:szCs w:val="18"/>
         </w:rPr>
-        <w:t xml:space="preserve">This is a class project, not financial advice. Prices move every second, so recheck them on the buy date and drop a share if the total goes over $20,000.</w:t>
+        <w:t xml:space="preserve">This is a class project, not financial advice. Prices move every second, so recheck them on the buy date and make sure the total stays between $20,000 and $25,000.</w:t>
       </w:r>
     </w:p>
     <w:sectPr>

</xml_diff>